<commit_message>
Update PIMS with latest features: expiry dates, low stock alerts, item-wise reports, and print function
</commit_message>
<xml_diff>
--- a/OUTPUS/402410769_Programming_732_outputs.docx
+++ b/OUTPUS/402410769_Programming_732_outputs.docx
@@ -615,7 +615,7 @@
                           <pic:cNvPicPr/>
                         </pic:nvPicPr>
                         <pic:blipFill>
-                          <a:blip r:embed="rId4"/>
+                          <a:blip r:embed="rId5"/>
                           <a:stretch>
                             <a:fillRect/>
                           </a:stretch>
@@ -636,7 +636,7 @@
                           <pic:cNvPicPr/>
                         </pic:nvPicPr>
                         <pic:blipFill>
-                          <a:blip r:embed="rId5"/>
+                          <a:blip r:embed="rId6"/>
                           <a:stretch>
                             <a:fillRect/>
                           </a:stretch>
@@ -861,7 +861,7 @@
                           <pic:cNvPicPr/>
                         </pic:nvPicPr>
                         <pic:blipFill>
-                          <a:blip r:embed="rId6"/>
+                          <a:blip r:embed="rId7"/>
                           <a:stretch>
                             <a:fillRect/>
                           </a:stretch>
@@ -3299,10 +3299,10 @@
                   <o:lock v:ext="edit" aspectratio="t"/>
                 </v:shapetype>
                 <v:shape id="Picture 375" o:spid="_x0000_s1029" type="#_x0000_t75" style="position:absolute;left:53356;top:4363;width:18758;height:5697;visibility:visible;mso-wrap-style:square" o:gfxdata="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">
-                  <v:imagedata r:id="rId7" o:title=""/>
+                  <v:imagedata r:id="rId8" o:title=""/>
                 </v:shape>
                 <v:shape id="Picture 377" o:spid="_x0000_s1030" type="#_x0000_t75" style="position:absolute;left:701;top:4572;width:34983;height:3718;visibility:visible;mso-wrap-style:square" o:gfxdata="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">
-                  <v:imagedata r:id="rId8" o:title=""/>
+                  <v:imagedata r:id="rId9" o:title=""/>
                 </v:shape>
                 <v:rect id="Rectangle 378" o:spid="_x0000_s1031" style="position:absolute;left:701;top:5267;width:21264;height:2421;visibility:visible;mso-wrap-style:square;v-text-anchor:top" o:gfxdata="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" filled="f" stroked="f">
                   <v:textbox inset="0,0,0,0">
@@ -3407,7 +3407,7 @@
                   </v:textbox>
                 </v:rect>
                 <v:shape id="Picture 385" o:spid="_x0000_s1037" type="#_x0000_t75" style="position:absolute;left:64411;top:9204;width:6782;height:1982;visibility:visible;mso-wrap-style:square" o:gfxdata="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">
-                  <v:imagedata r:id="rId9" o:title=""/>
+                  <v:imagedata r:id="rId10" o:title=""/>
                 </v:shape>
                 <v:shape id="Shape 3825" o:spid="_x0000_s1038" style="position:absolute;left:66473;top:10062;width:99;height:727;visibility:visible;mso-wrap-style:square;v-text-anchor:top" coordsize="9906,72771" o:gfxdata="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" path="m,l9906,r,72771l,72771,,e" stroked="f" strokeweight="0">
                   <v:stroke miterlimit="83231f" joinstyle="miter"/>
@@ -3541,7 +3541,6 @@
         <w:tblCellMar>
           <w:top w:w="38" w:type="dxa"/>
           <w:left w:w="4" w:type="dxa"/>
-          <w:bottom w:w="0" w:type="dxa"/>
           <w:right w:w="115" w:type="dxa"/>
         </w:tblCellMar>
         <w:tblLook w:val="04A0" w:firstRow="1" w:lastRow="0" w:firstColumn="1" w:lastColumn="0" w:noHBand="0" w:noVBand="1"/>
@@ -3570,7 +3569,6 @@
           </w:tcPr>
           <w:p>
             <w:pPr>
-              <w:spacing w:after="0"/>
               <w:ind w:right="25"/>
               <w:jc w:val="center"/>
             </w:pPr>
@@ -3605,7 +3603,6 @@
           </w:tcPr>
           <w:p>
             <w:pPr>
-              <w:spacing w:after="0"/>
               <w:ind w:left="492"/>
             </w:pPr>
             <w:r>
@@ -3639,7 +3636,6 @@
           </w:tcPr>
           <w:p>
             <w:pPr>
-              <w:spacing w:after="0"/>
               <w:ind w:left="390"/>
             </w:pPr>
             <w:r>
@@ -3673,7 +3669,6 @@
           </w:tcPr>
           <w:p>
             <w:pPr>
-              <w:spacing w:after="0"/>
               <w:ind w:right="16"/>
               <w:jc w:val="center"/>
             </w:pPr>
@@ -3710,9 +3705,6 @@
             </w:tcBorders>
           </w:tcPr>
           <w:p>
-            <w:pPr>
-              <w:spacing w:after="0"/>
-            </w:pPr>
             <w:r>
               <w:rPr>
                 <w:sz w:val="16"/>
@@ -3733,7 +3725,6 @@
           </w:tcPr>
           <w:p>
             <w:pPr>
-              <w:spacing w:after="0"/>
               <w:ind w:left="1"/>
             </w:pPr>
             <w:r>
@@ -3756,7 +3747,6 @@
           </w:tcPr>
           <w:p>
             <w:pPr>
-              <w:spacing w:after="0"/>
               <w:ind w:left="1"/>
             </w:pPr>
             <w:r>
@@ -3779,7 +3769,6 @@
           </w:tcPr>
           <w:p>
             <w:pPr>
-              <w:spacing w:after="0"/>
               <w:ind w:left="2"/>
             </w:pPr>
             <w:r>
@@ -3806,9 +3795,6 @@
             </w:tcBorders>
           </w:tcPr>
           <w:p>
-            <w:pPr>
-              <w:spacing w:after="0"/>
-            </w:pPr>
             <w:r>
               <w:rPr>
                 <w:sz w:val="16"/>
@@ -3829,7 +3815,6 @@
           </w:tcPr>
           <w:p>
             <w:pPr>
-              <w:spacing w:after="0"/>
               <w:ind w:left="1"/>
             </w:pPr>
             <w:r>
@@ -3852,7 +3837,6 @@
           </w:tcPr>
           <w:p>
             <w:pPr>
-              <w:spacing w:after="0"/>
               <w:ind w:left="1"/>
             </w:pPr>
             <w:r>
@@ -3875,7 +3859,6 @@
           </w:tcPr>
           <w:p>
             <w:pPr>
-              <w:spacing w:after="0"/>
               <w:ind w:left="2"/>
             </w:pPr>
             <w:r>
@@ -3902,9 +3885,6 @@
             </w:tcBorders>
           </w:tcPr>
           <w:p>
-            <w:pPr>
-              <w:spacing w:after="0"/>
-            </w:pPr>
             <w:r>
               <w:rPr>
                 <w:sz w:val="16"/>
@@ -3925,7 +3905,6 @@
           </w:tcPr>
           <w:p>
             <w:pPr>
-              <w:spacing w:after="0"/>
               <w:ind w:left="1"/>
             </w:pPr>
             <w:r>
@@ -3948,7 +3927,6 @@
           </w:tcPr>
           <w:p>
             <w:pPr>
-              <w:spacing w:after="0"/>
               <w:ind w:left="1"/>
             </w:pPr>
             <w:r>
@@ -3971,7 +3949,6 @@
           </w:tcPr>
           <w:p>
             <w:pPr>
-              <w:spacing w:after="0"/>
               <w:ind w:left="2"/>
             </w:pPr>
             <w:r>
@@ -3998,9 +3975,6 @@
             </w:tcBorders>
           </w:tcPr>
           <w:p>
-            <w:pPr>
-              <w:spacing w:after="0"/>
-            </w:pPr>
             <w:r>
               <w:rPr>
                 <w:sz w:val="16"/>
@@ -4021,7 +3995,6 @@
           </w:tcPr>
           <w:p>
             <w:pPr>
-              <w:spacing w:after="0"/>
               <w:ind w:left="1"/>
             </w:pPr>
             <w:r>
@@ -4044,7 +4017,6 @@
           </w:tcPr>
           <w:p>
             <w:pPr>
-              <w:spacing w:after="0"/>
               <w:ind w:left="1"/>
             </w:pPr>
             <w:r>
@@ -4067,7 +4039,6 @@
           </w:tcPr>
           <w:p>
             <w:pPr>
-              <w:spacing w:after="0"/>
               <w:ind w:left="2"/>
             </w:pPr>
             <w:r>
@@ -4094,9 +4065,6 @@
             </w:tcBorders>
           </w:tcPr>
           <w:p>
-            <w:pPr>
-              <w:spacing w:after="0"/>
-            </w:pPr>
             <w:r>
               <w:rPr>
                 <w:sz w:val="16"/>
@@ -4117,7 +4085,6 @@
           </w:tcPr>
           <w:p>
             <w:pPr>
-              <w:spacing w:after="0"/>
               <w:ind w:left="1"/>
             </w:pPr>
             <w:r>
@@ -4140,7 +4107,6 @@
           </w:tcPr>
           <w:p>
             <w:pPr>
-              <w:spacing w:after="0"/>
               <w:ind w:left="1"/>
             </w:pPr>
             <w:r>
@@ -4163,7 +4129,6 @@
           </w:tcPr>
           <w:p>
             <w:pPr>
-              <w:spacing w:after="0"/>
               <w:ind w:left="2"/>
             </w:pPr>
             <w:r>
@@ -4190,9 +4155,6 @@
             </w:tcBorders>
           </w:tcPr>
           <w:p>
-            <w:pPr>
-              <w:spacing w:after="0"/>
-            </w:pPr>
             <w:r>
               <w:rPr>
                 <w:sz w:val="16"/>
@@ -4213,7 +4175,6 @@
           </w:tcPr>
           <w:p>
             <w:pPr>
-              <w:spacing w:after="0"/>
               <w:ind w:left="1"/>
             </w:pPr>
             <w:r>
@@ -4236,7 +4197,6 @@
           </w:tcPr>
           <w:p>
             <w:pPr>
-              <w:spacing w:after="0"/>
               <w:ind w:left="1"/>
             </w:pPr>
             <w:r>
@@ -4259,7 +4219,6 @@
           </w:tcPr>
           <w:p>
             <w:pPr>
-              <w:spacing w:after="0"/>
               <w:ind w:left="2"/>
             </w:pPr>
             <w:r>
@@ -4286,9 +4245,6 @@
             </w:tcBorders>
           </w:tcPr>
           <w:p>
-            <w:pPr>
-              <w:spacing w:after="0"/>
-            </w:pPr>
             <w:r>
               <w:rPr>
                 <w:sz w:val="16"/>
@@ -4309,7 +4265,6 @@
           </w:tcPr>
           <w:p>
             <w:pPr>
-              <w:spacing w:after="0"/>
               <w:ind w:left="1"/>
             </w:pPr>
             <w:r>
@@ -4332,7 +4287,6 @@
           </w:tcPr>
           <w:p>
             <w:pPr>
-              <w:spacing w:after="0"/>
               <w:ind w:left="1"/>
             </w:pPr>
             <w:r>
@@ -4355,7 +4309,6 @@
           </w:tcPr>
           <w:p>
             <w:pPr>
-              <w:spacing w:after="0"/>
               <w:ind w:left="2"/>
             </w:pPr>
             <w:r>
@@ -4382,9 +4335,6 @@
             </w:tcBorders>
           </w:tcPr>
           <w:p>
-            <w:pPr>
-              <w:spacing w:after="0"/>
-            </w:pPr>
             <w:r>
               <w:rPr>
                 <w:sz w:val="16"/>
@@ -4405,7 +4355,6 @@
           </w:tcPr>
           <w:p>
             <w:pPr>
-              <w:spacing w:after="0"/>
               <w:ind w:left="1"/>
             </w:pPr>
             <w:r>
@@ -4428,7 +4377,6 @@
           </w:tcPr>
           <w:p>
             <w:pPr>
-              <w:spacing w:after="0"/>
               <w:ind w:left="1"/>
             </w:pPr>
             <w:r>
@@ -4451,7 +4399,6 @@
           </w:tcPr>
           <w:p>
             <w:pPr>
-              <w:spacing w:after="0"/>
               <w:ind w:left="2"/>
             </w:pPr>
             <w:r>
@@ -4536,30 +4483,60 @@
           <w:color w:val="043171"/>
           <w:sz w:val="16"/>
         </w:rPr>
-        <w:t xml:space="preserve">Use Times New Roman font, size 12, with </w:t>
-      </w:r>
-      <w:proofErr w:type="gramStart"/>
-      <w:r>
-        <w:rPr>
+        <w:t>Use Times New Roman font, size 12, with 1.5 line spacing throughout the document. Apply Harvard Referencing Style for all citations and references.</w:t>
+      </w:r>
+      <w:r>
+        <w:rPr>
+          <w:sz w:val="16"/>
+        </w:rPr>
+        <w:t xml:space="preserve"> </w:t>
+      </w:r>
+    </w:p>
+    <w:p>
+      <w:pPr>
+        <w:spacing w:after="37"/>
+        <w:ind w:left="378" w:hanging="10"/>
+      </w:pPr>
+      <w:r>
+        <w:rPr>
+          <w:b/>
           <w:color w:val="043171"/>
           <w:sz w:val="16"/>
         </w:rPr>
-        <w:t>1.5 line</w:t>
-      </w:r>
-      <w:proofErr w:type="gramEnd"/>
+        <w:t>For essay-style assignments, please include the following sections:</w:t>
+      </w:r>
+      <w:r>
+        <w:rPr>
+          <w:b/>
+          <w:sz w:val="16"/>
+        </w:rPr>
+        <w:t xml:space="preserve"> </w:t>
+      </w:r>
+    </w:p>
+    <w:p>
+      <w:pPr>
+        <w:spacing w:after="62" w:line="251" w:lineRule="auto"/>
+        <w:ind w:left="719" w:hanging="10"/>
+      </w:pPr>
       <w:r>
         <w:rPr>
           <w:color w:val="043171"/>
           <w:sz w:val="16"/>
         </w:rPr>
-        <w:t xml:space="preserve"> spacing throughout the document. Apply Harvard </w:t>
-      </w:r>
+        <w:t xml:space="preserve">Table of Contents </w:t>
+      </w:r>
+    </w:p>
+    <w:p>
+      <w:pPr>
+        <w:spacing w:after="62" w:line="251" w:lineRule="auto"/>
+        <w:ind w:left="719" w:hanging="10"/>
+      </w:pPr>
       <w:r>
         <w:rPr>
           <w:color w:val="043171"/>
           <w:sz w:val="16"/>
         </w:rPr>
-        <w:t>Referencing Style for all citations and references.</w:t>
+        <w:t>Introduction</w:t>
       </w:r>
       <w:r>
         <w:rPr>
@@ -4570,23 +4547,15 @@
     </w:p>
     <w:p>
       <w:pPr>
-        <w:spacing w:after="37"/>
-        <w:ind w:left="378" w:hanging="10"/>
-      </w:pPr>
-      <w:r>
-        <w:rPr>
-          <w:b/>
+        <w:spacing w:after="62" w:line="251" w:lineRule="auto"/>
+        <w:ind w:left="719" w:hanging="10"/>
+      </w:pPr>
+      <w:r>
+        <w:rPr>
           <w:color w:val="043171"/>
           <w:sz w:val="16"/>
         </w:rPr>
-        <w:t>For essay-style assignments, please include the following sections:</w:t>
-      </w:r>
-      <w:r>
-        <w:rPr>
-          <w:b/>
-          <w:sz w:val="16"/>
-        </w:rPr>
-        <w:t xml:space="preserve"> </w:t>
+        <w:t xml:space="preserve">Main Body (with relevant subheadings) </w:t>
       </w:r>
     </w:p>
     <w:p>
@@ -4599,7 +4568,45 @@
           <w:color w:val="043171"/>
           <w:sz w:val="16"/>
         </w:rPr>
-        <w:t xml:space="preserve">Table of Contents </w:t>
+        <w:t>Conclusion</w:t>
+      </w:r>
+      <w:r>
+        <w:rPr>
+          <w:sz w:val="16"/>
+        </w:rPr>
+        <w:t xml:space="preserve"> </w:t>
+      </w:r>
+    </w:p>
+    <w:p>
+      <w:pPr>
+        <w:spacing w:after="170" w:line="251" w:lineRule="auto"/>
+        <w:ind w:left="719" w:hanging="10"/>
+      </w:pPr>
+      <w:r>
+        <w:rPr>
+          <w:color w:val="043171"/>
+          <w:sz w:val="16"/>
+        </w:rPr>
+        <w:t>References</w:t>
+      </w:r>
+      <w:r>
+        <w:rPr>
+          <w:sz w:val="16"/>
+        </w:rPr>
+        <w:t xml:space="preserve"> </w:t>
+      </w:r>
+    </w:p>
+    <w:p>
+      <w:pPr>
+        <w:spacing w:after="38" w:line="251" w:lineRule="auto"/>
+        <w:ind w:left="719" w:hanging="10"/>
+      </w:pPr>
+      <w:r>
+        <w:rPr>
+          <w:color w:val="043171"/>
+          <w:sz w:val="16"/>
+        </w:rPr>
+        <w:t xml:space="preserve">Submit the assignment in PDF format on Moodle. </w:t>
       </w:r>
     </w:p>
     <w:p>
@@ -4612,7 +4619,7 @@
           <w:color w:val="043171"/>
           <w:sz w:val="16"/>
         </w:rPr>
-        <w:t>Introduction</w:t>
+        <w:t>Use the specified cover page provided.</w:t>
       </w:r>
       <w:r>
         <w:rPr>
@@ -4623,7 +4630,7 @@
     </w:p>
     <w:p>
       <w:pPr>
-        <w:spacing w:after="62" w:line="251" w:lineRule="auto"/>
+        <w:spacing w:after="6" w:line="251" w:lineRule="auto"/>
         <w:ind w:left="719" w:hanging="10"/>
       </w:pPr>
       <w:r>
@@ -4631,23 +4638,49 @@
           <w:color w:val="043171"/>
           <w:sz w:val="16"/>
         </w:rPr>
-        <w:t xml:space="preserve">Main Body (with relevant subheadings) </w:t>
-      </w:r>
-    </w:p>
-    <w:p>
-      <w:pPr>
-        <w:spacing w:after="62" w:line="251" w:lineRule="auto"/>
-        <w:ind w:left="719" w:hanging="10"/>
-      </w:pPr>
-      <w:r>
-        <w:rPr>
+        <w:t>Include a signed declaration of originality.</w:t>
+      </w:r>
+      <w:r>
+        <w:rPr>
+          <w:sz w:val="16"/>
+        </w:rPr>
+        <w:t xml:space="preserve"> </w:t>
+      </w:r>
+    </w:p>
+    <w:p>
+      <w:pPr>
+        <w:spacing w:after="15"/>
+        <w:ind w:left="372"/>
+      </w:pPr>
+      <w:r>
+        <w:rPr>
+          <w:sz w:val="16"/>
+        </w:rPr>
+        <w:t xml:space="preserve"> </w:t>
+      </w:r>
+    </w:p>
+    <w:p>
+      <w:pPr>
+        <w:spacing w:after="0"/>
+        <w:ind w:left="372"/>
+      </w:pPr>
+      <w:r>
+        <w:rPr>
+          <w:sz w:val="16"/>
+        </w:rPr>
+        <w:t xml:space="preserve"> </w:t>
+      </w:r>
+      <w:r>
+        <w:rPr>
+          <w:b/>
           <w:color w:val="043171"/>
           <w:sz w:val="16"/>
         </w:rPr>
-        <w:t>Conclusion</w:t>
-      </w:r>
-      <w:r>
-        <w:rPr>
+        <w:t>DECLARATION OF ORIGINALITY:</w:t>
+      </w:r>
+      <w:r>
+        <w:rPr>
+          <w:b/>
           <w:sz w:val="16"/>
         </w:rPr>
         <w:t xml:space="preserve"> </w:t>
@@ -4655,15 +4688,15 @@
     </w:p>
     <w:p>
       <w:pPr>
-        <w:spacing w:after="170" w:line="251" w:lineRule="auto"/>
-        <w:ind w:left="719" w:hanging="10"/>
+        <w:spacing w:after="14" w:line="251" w:lineRule="auto"/>
+        <w:ind w:left="393" w:hanging="10"/>
       </w:pPr>
       <w:r>
         <w:rPr>
           <w:color w:val="043171"/>
           <w:sz w:val="16"/>
         </w:rPr>
-        <w:t>References</w:t>
+        <w:t>I hereby declare that this assignment is my own work and has not been copied from any other source except where due acknowledgment is made. I affirm that all sources used have been properly cited and that this submission complies with the institution’s policies on academic integrity and plagiarism.</w:t>
       </w:r>
       <w:r>
         <w:rPr>
@@ -4674,124 +4707,11 @@
     </w:p>
     <w:p>
       <w:pPr>
-        <w:spacing w:after="38" w:line="251" w:lineRule="auto"/>
-        <w:ind w:left="719" w:hanging="10"/>
-      </w:pPr>
-      <w:r>
+        <w:spacing w:after="0"/>
         <w:rPr>
           <w:color w:val="043171"/>
-          <w:sz w:val="16"/>
-        </w:rPr>
-        <w:t xml:space="preserve">Submit the assignment in PDF format on Moodle. </w:t>
-      </w:r>
-    </w:p>
-    <w:p>
-      <w:pPr>
-        <w:spacing w:after="62" w:line="251" w:lineRule="auto"/>
-        <w:ind w:left="719" w:hanging="10"/>
-      </w:pPr>
-      <w:r>
-        <w:rPr>
-          <w:color w:val="043171"/>
-          <w:sz w:val="16"/>
-        </w:rPr>
-        <w:t>Use the specified cover page provided.</w:t>
-      </w:r>
-      <w:r>
-        <w:rPr>
-          <w:sz w:val="16"/>
-        </w:rPr>
-        <w:t xml:space="preserve"> </w:t>
-      </w:r>
-    </w:p>
-    <w:p>
-      <w:pPr>
-        <w:spacing w:after="6" w:line="251" w:lineRule="auto"/>
-        <w:ind w:left="719" w:hanging="10"/>
-      </w:pPr>
-      <w:r>
-        <w:rPr>
-          <w:color w:val="043171"/>
-          <w:sz w:val="16"/>
-        </w:rPr>
-        <w:t>Include a signed declaration of originality.</w:t>
-      </w:r>
-      <w:r>
-        <w:rPr>
-          <w:sz w:val="16"/>
-        </w:rPr>
-        <w:t xml:space="preserve"> </w:t>
-      </w:r>
-    </w:p>
-    <w:p>
-      <w:pPr>
-        <w:spacing w:after="15"/>
-        <w:ind w:left="372"/>
-      </w:pPr>
-      <w:r>
-        <w:rPr>
-          <w:sz w:val="16"/>
-        </w:rPr>
-        <w:t xml:space="preserve"> </w:t>
-      </w:r>
-    </w:p>
-    <w:p>
-      <w:pPr>
-        <w:spacing w:after="0"/>
-        <w:ind w:left="372"/>
-      </w:pPr>
-      <w:r>
-        <w:rPr>
-          <w:sz w:val="16"/>
-        </w:rPr>
-        <w:t xml:space="preserve"> </w:t>
-      </w:r>
-      <w:r>
-        <w:rPr>
-          <w:b/>
-          <w:color w:val="043171"/>
-          <w:sz w:val="16"/>
-        </w:rPr>
-        <w:t>DECLARATION OF ORIGINALITY:</w:t>
-      </w:r>
-      <w:r>
-        <w:rPr>
-          <w:b/>
-          <w:sz w:val="16"/>
-        </w:rPr>
-        <w:t xml:space="preserve"> </w:t>
-      </w:r>
-    </w:p>
-    <w:p>
-      <w:pPr>
-        <w:spacing w:after="14" w:line="251" w:lineRule="auto"/>
-        <w:ind w:left="393" w:hanging="10"/>
-      </w:pPr>
-      <w:r>
-        <w:rPr>
-          <w:color w:val="043171"/>
-          <w:sz w:val="16"/>
-        </w:rPr>
-        <w:t>I hereby declare that this assignment is my own work and has not been copied from any other source except where due acknowledgment is made. I affirm that all sources used have been properly cited and that this submission complies with the institution’s policies on academic integrity and plagiarism.</w:t>
-      </w:r>
-      <w:r>
-        <w:rPr>
-          <w:sz w:val="16"/>
-        </w:rPr>
-        <w:t xml:space="preserve"> </w:t>
-      </w:r>
-    </w:p>
-    <w:p>
-      <w:pPr>
-        <w:spacing w:after="0"/>
-        <w:rPr>
           <w:sz w:val="18"/>
         </w:rPr>
-      </w:pPr>
-    </w:p>
-    <w:p>
-      <w:pPr>
-        <w:spacing w:after="0"/>
       </w:pPr>
       <w:r>
         <w:rPr>
@@ -4815,50 +4735,50 @@
           <w:sz w:val="18"/>
           <w:u w:val="single" w:color="043171"/>
         </w:rPr>
-        <w:tab/>
+        <w:t>KV Bosele</w:t>
       </w:r>
       <w:r>
         <w:rPr>
           <w:color w:val="043171"/>
           <w:sz w:val="18"/>
-        </w:rPr>
-        <w:t xml:space="preserve"> </w:t>
+          <w:u w:val="single" w:color="043171"/>
+        </w:rPr>
+        <w:tab/>
       </w:r>
       <w:r>
         <w:rPr>
           <w:color w:val="043171"/>
           <w:sz w:val="18"/>
         </w:rPr>
-        <w:tab/>
-      </w:r>
-      <w:r>
-        <w:rPr>
-          <w:b/>
+        <w:t xml:space="preserve"> </w:t>
+      </w:r>
+      <w:r>
+        <w:rPr>
           <w:color w:val="043171"/>
           <w:sz w:val="18"/>
         </w:rPr>
-        <w:t xml:space="preserve">Date: </w:t>
-      </w:r>
-      <w:r>
-        <w:rPr>
+        <w:tab/>
+      </w:r>
+      <w:r>
+        <w:rPr>
+          <w:b/>
           <w:color w:val="043171"/>
           <w:sz w:val="18"/>
         </w:rPr>
-        <w:t xml:space="preserve"> </w:t>
-      </w:r>
-    </w:p>
-    <w:p>
-      <w:pPr>
-        <w:spacing w:after="0" w:line="437" w:lineRule="auto"/>
-      </w:pPr>
-      <w:r>
-        <w:rPr>
-          <w:rFonts w:ascii="Tahoma" w:eastAsia="Tahoma" w:hAnsi="Tahoma" w:cs="Tahoma"/>
-          <w:sz w:val="20"/>
-        </w:rPr>
-        <w:lastRenderedPageBreak/>
-        <w:t xml:space="preserve"> </w:t>
-      </w:r>
+        <w:t xml:space="preserve">Date: </w:t>
+      </w:r>
+      <w:r>
+        <w:rPr>
+          <w:color w:val="043171"/>
+          <w:sz w:val="18"/>
+        </w:rPr>
+        <w:t xml:space="preserve"> 21 September 2026 </w:t>
+      </w:r>
+    </w:p>
+    <w:p>
+      <w:pPr>
+        <w:spacing w:after="0"/>
+      </w:pPr>
       <w:r>
         <w:rPr>
           <w:rFonts w:ascii="Tahoma" w:eastAsia="Tahoma" w:hAnsi="Tahoma" w:cs="Tahoma"/>
@@ -4866,15 +4786,1272 @@
           <w:color w:val="053070"/>
           <w:sz w:val="12"/>
         </w:rPr>
-        <w:t>Richfield Graduate Institute of Technology (Pty) Ltd is registered with the Department of Higher Education &amp; Training as a Private Higher Education Institution under the Higher Education Act, 1997, Registration Certificate No. 2000/HE07/008.</w:t>
+        <w:t>Richfield Graduate Institute of Technology (Pty) Ltd is registered with the Department of Higher Education &amp; Training as a Private Higher Education Institution under the Higher Educ</w:t>
       </w:r>
       <w:r>
         <w:rPr>
           <w:rFonts w:ascii="Tahoma" w:eastAsia="Tahoma" w:hAnsi="Tahoma" w:cs="Tahoma"/>
           <w:b/>
+          <w:color w:val="053070"/>
           <w:sz w:val="12"/>
         </w:rPr>
+        <w:t>ation Act, 1997, Registration Certificate No. 2000/HE07/008.</w:t>
+      </w:r>
+      <w:r>
+        <w:rPr>
+          <w:rFonts w:ascii="Tahoma" w:eastAsia="Tahoma" w:hAnsi="Tahoma" w:cs="Tahoma"/>
+          <w:b/>
+          <w:sz w:val="12"/>
+        </w:rPr>
         <w:t xml:space="preserve"> </w:t>
+      </w:r>
+    </w:p>
+    <w:sdt>
+      <w:sdtPr>
+        <w:id w:val="-1125693923"/>
+        <w:docPartObj>
+          <w:docPartGallery w:val="Table of Contents"/>
+          <w:docPartUnique/>
+        </w:docPartObj>
+      </w:sdtPr>
+      <w:sdtEndPr>
+        <w:rPr>
+          <w:rFonts w:ascii="Calibri" w:eastAsia="Calibri" w:hAnsi="Calibri" w:cs="Calibri"/>
+          <w:b/>
+          <w:bCs/>
+          <w:noProof/>
+          <w:color w:val="000000"/>
+          <w:kern w:val="2"/>
+          <w:sz w:val="22"/>
+          <w:szCs w:val="24"/>
+          <w:lang w:val="en-ZA" w:eastAsia="en-ZA"/>
+          <w14:ligatures w14:val="standardContextual"/>
+        </w:rPr>
+      </w:sdtEndPr>
+      <w:sdtContent>
+        <w:p>
+          <w:pPr>
+            <w:pStyle w:val="TOCHeading"/>
+          </w:pPr>
+          <w:r>
+            <w:t>Contents</w:t>
+          </w:r>
+        </w:p>
+        <w:p>
+          <w:fldSimple w:instr=" TOC \o &quot;1-3&quot; \h \z \u ">
+            <w:r>
+              <w:rPr>
+                <w:b/>
+                <w:bCs/>
+                <w:noProof/>
+                <w:lang w:val="en-US"/>
+              </w:rPr>
+              <w:t>No table of contents entries found.</w:t>
+            </w:r>
+          </w:fldSimple>
+        </w:p>
+      </w:sdtContent>
+    </w:sdt>
+    <w:p>
+      <w:pPr>
+        <w:spacing w:after="0" w:line="437" w:lineRule="auto"/>
+        <w:rPr>
+          <w:rFonts w:ascii="Times New Roman" w:eastAsia="Tahoma" w:hAnsi="Times New Roman" w:cs="Times New Roman"/>
+          <w:b/>
+          <w:sz w:val="24"/>
+        </w:rPr>
+      </w:pPr>
+    </w:p>
+    <w:p>
+      <w:pPr>
+        <w:spacing w:after="0" w:line="437" w:lineRule="auto"/>
+        <w:rPr>
+          <w:rFonts w:ascii="Times New Roman" w:eastAsia="Tahoma" w:hAnsi="Times New Roman" w:cs="Times New Roman"/>
+          <w:b/>
+          <w:sz w:val="24"/>
+        </w:rPr>
+      </w:pPr>
+    </w:p>
+    <w:p>
+      <w:pPr>
+        <w:spacing w:after="0" w:line="437" w:lineRule="auto"/>
+        <w:rPr>
+          <w:rFonts w:ascii="Times New Roman" w:eastAsia="Tahoma" w:hAnsi="Times New Roman" w:cs="Times New Roman"/>
+          <w:b/>
+          <w:sz w:val="24"/>
+        </w:rPr>
+      </w:pPr>
+    </w:p>
+    <w:p>
+      <w:pPr>
+        <w:spacing w:after="0" w:line="437" w:lineRule="auto"/>
+        <w:rPr>
+          <w:rFonts w:ascii="Times New Roman" w:eastAsia="Tahoma" w:hAnsi="Times New Roman" w:cs="Times New Roman"/>
+          <w:b/>
+          <w:sz w:val="24"/>
+        </w:rPr>
+      </w:pPr>
+    </w:p>
+    <w:p>
+      <w:pPr>
+        <w:spacing w:after="0" w:line="437" w:lineRule="auto"/>
+        <w:rPr>
+          <w:rFonts w:ascii="Times New Roman" w:eastAsia="Tahoma" w:hAnsi="Times New Roman" w:cs="Times New Roman"/>
+          <w:b/>
+          <w:sz w:val="24"/>
+        </w:rPr>
+      </w:pPr>
+    </w:p>
+    <w:p>
+      <w:pPr>
+        <w:spacing w:after="0" w:line="437" w:lineRule="auto"/>
+        <w:rPr>
+          <w:rFonts w:ascii="Times New Roman" w:eastAsia="Tahoma" w:hAnsi="Times New Roman" w:cs="Times New Roman"/>
+          <w:b/>
+          <w:sz w:val="24"/>
+        </w:rPr>
+      </w:pPr>
+    </w:p>
+    <w:p>
+      <w:pPr>
+        <w:spacing w:after="0" w:line="437" w:lineRule="auto"/>
+        <w:rPr>
+          <w:rFonts w:ascii="Times New Roman" w:eastAsia="Tahoma" w:hAnsi="Times New Roman" w:cs="Times New Roman"/>
+          <w:b/>
+          <w:sz w:val="24"/>
+        </w:rPr>
+      </w:pPr>
+    </w:p>
+    <w:p>
+      <w:pPr>
+        <w:spacing w:after="0" w:line="437" w:lineRule="auto"/>
+        <w:rPr>
+          <w:rFonts w:ascii="Times New Roman" w:eastAsia="Tahoma" w:hAnsi="Times New Roman" w:cs="Times New Roman"/>
+          <w:b/>
+          <w:sz w:val="24"/>
+        </w:rPr>
+      </w:pPr>
+    </w:p>
+    <w:p>
+      <w:pPr>
+        <w:spacing w:after="0" w:line="437" w:lineRule="auto"/>
+        <w:rPr>
+          <w:rFonts w:ascii="Times New Roman" w:eastAsia="Tahoma" w:hAnsi="Times New Roman" w:cs="Times New Roman"/>
+          <w:b/>
+          <w:sz w:val="24"/>
+        </w:rPr>
+      </w:pPr>
+    </w:p>
+    <w:p>
+      <w:pPr>
+        <w:spacing w:after="0" w:line="437" w:lineRule="auto"/>
+        <w:rPr>
+          <w:rFonts w:ascii="Times New Roman" w:eastAsia="Tahoma" w:hAnsi="Times New Roman" w:cs="Times New Roman"/>
+          <w:b/>
+          <w:sz w:val="24"/>
+        </w:rPr>
+      </w:pPr>
+    </w:p>
+    <w:p>
+      <w:pPr>
+        <w:spacing w:after="0" w:line="437" w:lineRule="auto"/>
+        <w:rPr>
+          <w:rFonts w:ascii="Times New Roman" w:eastAsia="Tahoma" w:hAnsi="Times New Roman" w:cs="Times New Roman"/>
+          <w:b/>
+          <w:sz w:val="24"/>
+        </w:rPr>
+      </w:pPr>
+    </w:p>
+    <w:p>
+      <w:pPr>
+        <w:spacing w:after="0" w:line="437" w:lineRule="auto"/>
+        <w:rPr>
+          <w:rFonts w:ascii="Times New Roman" w:eastAsia="Tahoma" w:hAnsi="Times New Roman" w:cs="Times New Roman"/>
+          <w:b/>
+          <w:sz w:val="24"/>
+        </w:rPr>
+      </w:pPr>
+    </w:p>
+    <w:p>
+      <w:pPr>
+        <w:spacing w:after="0" w:line="437" w:lineRule="auto"/>
+        <w:rPr>
+          <w:rFonts w:ascii="Times New Roman" w:eastAsia="Tahoma" w:hAnsi="Times New Roman" w:cs="Times New Roman"/>
+          <w:b/>
+          <w:sz w:val="24"/>
+        </w:rPr>
+      </w:pPr>
+    </w:p>
+    <w:p>
+      <w:pPr>
+        <w:spacing w:after="0" w:line="437" w:lineRule="auto"/>
+        <w:rPr>
+          <w:rFonts w:ascii="Times New Roman" w:eastAsia="Tahoma" w:hAnsi="Times New Roman" w:cs="Times New Roman"/>
+          <w:b/>
+          <w:sz w:val="24"/>
+        </w:rPr>
+      </w:pPr>
+    </w:p>
+    <w:p>
+      <w:pPr>
+        <w:spacing w:after="0" w:line="437" w:lineRule="auto"/>
+        <w:rPr>
+          <w:rFonts w:ascii="Times New Roman" w:eastAsia="Tahoma" w:hAnsi="Times New Roman" w:cs="Times New Roman"/>
+          <w:b/>
+          <w:sz w:val="24"/>
+        </w:rPr>
+      </w:pPr>
+    </w:p>
+    <w:p>
+      <w:pPr>
+        <w:spacing w:after="0" w:line="437" w:lineRule="auto"/>
+        <w:rPr>
+          <w:rFonts w:ascii="Times New Roman" w:eastAsia="Tahoma" w:hAnsi="Times New Roman" w:cs="Times New Roman"/>
+          <w:b/>
+          <w:sz w:val="24"/>
+        </w:rPr>
+      </w:pPr>
+    </w:p>
+    <w:p>
+      <w:pPr>
+        <w:spacing w:after="0" w:line="437" w:lineRule="auto"/>
+        <w:rPr>
+          <w:rFonts w:ascii="Times New Roman" w:eastAsia="Tahoma" w:hAnsi="Times New Roman" w:cs="Times New Roman"/>
+          <w:b/>
+          <w:sz w:val="24"/>
+        </w:rPr>
+      </w:pPr>
+    </w:p>
+    <w:p>
+      <w:pPr>
+        <w:spacing w:after="0" w:line="437" w:lineRule="auto"/>
+        <w:rPr>
+          <w:rFonts w:ascii="Times New Roman" w:eastAsia="Tahoma" w:hAnsi="Times New Roman" w:cs="Times New Roman"/>
+          <w:b/>
+          <w:sz w:val="24"/>
+        </w:rPr>
+      </w:pPr>
+    </w:p>
+    <w:p>
+      <w:pPr>
+        <w:spacing w:after="0" w:line="437" w:lineRule="auto"/>
+        <w:rPr>
+          <w:rFonts w:ascii="Times New Roman" w:eastAsia="Tahoma" w:hAnsi="Times New Roman" w:cs="Times New Roman"/>
+          <w:b/>
+          <w:sz w:val="24"/>
+        </w:rPr>
+      </w:pPr>
+    </w:p>
+    <w:p>
+      <w:pPr>
+        <w:spacing w:after="0" w:line="437" w:lineRule="auto"/>
+        <w:rPr>
+          <w:rFonts w:ascii="Times New Roman" w:eastAsia="Tahoma" w:hAnsi="Times New Roman" w:cs="Times New Roman"/>
+          <w:b/>
+          <w:sz w:val="24"/>
+        </w:rPr>
+      </w:pPr>
+    </w:p>
+    <w:p>
+      <w:pPr>
+        <w:spacing w:after="0" w:line="437" w:lineRule="auto"/>
+        <w:rPr>
+          <w:rFonts w:ascii="Times New Roman" w:eastAsia="Tahoma" w:hAnsi="Times New Roman" w:cs="Times New Roman"/>
+          <w:b/>
+          <w:sz w:val="24"/>
+        </w:rPr>
+      </w:pPr>
+    </w:p>
+    <w:p>
+      <w:pPr>
+        <w:spacing w:after="0" w:line="437" w:lineRule="auto"/>
+        <w:rPr>
+          <w:rFonts w:ascii="Times New Roman" w:eastAsia="Tahoma" w:hAnsi="Times New Roman" w:cs="Times New Roman"/>
+          <w:b/>
+          <w:sz w:val="24"/>
+        </w:rPr>
+      </w:pPr>
+    </w:p>
+    <w:p>
+      <w:pPr>
+        <w:spacing w:after="0" w:line="437" w:lineRule="auto"/>
+        <w:rPr>
+          <w:rFonts w:ascii="Times New Roman" w:eastAsia="Tahoma" w:hAnsi="Times New Roman" w:cs="Times New Roman"/>
+          <w:b/>
+          <w:sz w:val="24"/>
+        </w:rPr>
+      </w:pPr>
+    </w:p>
+    <w:p>
+      <w:pPr>
+        <w:spacing w:after="0" w:line="437" w:lineRule="auto"/>
+        <w:rPr>
+          <w:rFonts w:ascii="Times New Roman" w:eastAsia="Tahoma" w:hAnsi="Times New Roman" w:cs="Times New Roman"/>
+          <w:b/>
+          <w:sz w:val="24"/>
+        </w:rPr>
+      </w:pPr>
+    </w:p>
+    <w:p>
+      <w:pPr>
+        <w:spacing w:after="0" w:line="437" w:lineRule="auto"/>
+        <w:rPr>
+          <w:rFonts w:ascii="Times New Roman" w:eastAsia="Tahoma" w:hAnsi="Times New Roman" w:cs="Times New Roman"/>
+          <w:b/>
+          <w:sz w:val="24"/>
+        </w:rPr>
+      </w:pPr>
+    </w:p>
+    <w:p>
+      <w:pPr>
+        <w:spacing w:after="0" w:line="437" w:lineRule="auto"/>
+        <w:rPr>
+          <w:rFonts w:ascii="Times New Roman" w:eastAsia="Tahoma" w:hAnsi="Times New Roman" w:cs="Times New Roman"/>
+          <w:b/>
+          <w:sz w:val="24"/>
+        </w:rPr>
+      </w:pPr>
+    </w:p>
+    <w:p>
+      <w:pPr>
+        <w:pStyle w:val="Heading1"/>
+        <w:spacing w:line="360" w:lineRule="auto"/>
+        <w:rPr>
+          <w:rFonts w:ascii="Times New Roman" w:eastAsia="Tahoma" w:hAnsi="Times New Roman" w:cs="Times New Roman"/>
+          <w:color w:val="auto"/>
+        </w:rPr>
+      </w:pPr>
+      <w:r>
+        <w:rPr>
+          <w:rFonts w:ascii="Times New Roman" w:eastAsia="Tahoma" w:hAnsi="Times New Roman" w:cs="Times New Roman"/>
+          <w:color w:val="auto"/>
+        </w:rPr>
+        <w:lastRenderedPageBreak/>
+        <w:t xml:space="preserve">Programming 732 Assignment outputs </w:t>
+      </w:r>
+    </w:p>
+    <w:p>
+      <w:pPr>
+        <w:pStyle w:val="Heading2"/>
+        <w:spacing w:line="360" w:lineRule="auto"/>
+        <w:rPr>
+          <w:rFonts w:ascii="Times New Roman" w:hAnsi="Times New Roman" w:cs="Times New Roman"/>
+          <w:b/>
+          <w:bCs/>
+          <w:color w:val="auto"/>
+        </w:rPr>
+      </w:pPr>
+      <w:r>
+        <w:rPr>
+          <w:rFonts w:ascii="Times New Roman" w:hAnsi="Times New Roman" w:cs="Times New Roman"/>
+          <w:b/>
+          <w:bCs/>
+          <w:color w:val="auto"/>
+        </w:rPr>
+        <w:t xml:space="preserve">Login </w:t>
+      </w:r>
+      <w:r>
+        <w:rPr>
+          <w:rFonts w:ascii="Times New Roman" w:hAnsi="Times New Roman" w:cs="Times New Roman"/>
+          <w:b/>
+          <w:bCs/>
+          <w:color w:val="auto"/>
+        </w:rPr>
+        <w:t>Screen:</w:t>
+      </w:r>
+    </w:p>
+    <w:p>
+      <w:r>
+        <w:drawing>
+          <wp:inline distT="0" distB="0" distL="0" distR="0" wp14:anchorId="027620F0" wp14:editId="24804220">
+            <wp:extent cx="5893435" cy="3548380"/>
+            <wp:effectExtent l="0" t="0" r="0" b="0"/>
+            <wp:docPr id="2110701340" name="Picture 1"/>
+            <wp:cNvGraphicFramePr>
+              <a:graphicFrameLocks xmlns:a="http://schemas.openxmlformats.org/drawingml/2006/main" noChangeAspect="1"/>
+            </wp:cNvGraphicFramePr>
+            <a:graphic xmlns:a="http://schemas.openxmlformats.org/drawingml/2006/main">
+              <a:graphicData uri="http://schemas.openxmlformats.org/drawingml/2006/picture">
+                <pic:pic xmlns:pic="http://schemas.openxmlformats.org/drawingml/2006/picture">
+                  <pic:nvPicPr>
+                    <pic:cNvPr id="2110701340" name=""/>
+                    <pic:cNvPicPr/>
+                  </pic:nvPicPr>
+                  <pic:blipFill>
+                    <a:blip r:embed="rId11"/>
+                    <a:stretch>
+                      <a:fillRect/>
+                    </a:stretch>
+                  </pic:blipFill>
+                  <pic:spPr>
+                    <a:xfrm>
+                      <a:off x="0" y="0"/>
+                      <a:ext cx="5893435" cy="3548380"/>
+                    </a:xfrm>
+                    <a:prstGeom prst="rect">
+                      <a:avLst/>
+                    </a:prstGeom>
+                  </pic:spPr>
+                </pic:pic>
+              </a:graphicData>
+            </a:graphic>
+          </wp:inline>
+        </w:drawing>
+      </w:r>
+    </w:p>
+    <w:p/>
+    <w:p>
+      <w:pPr>
+        <w:pStyle w:val="Heading2"/>
+        <w:spacing w:line="360" w:lineRule="auto"/>
+        <w:rPr>
+          <w:rFonts w:ascii="Times New Roman" w:hAnsi="Times New Roman" w:cs="Times New Roman"/>
+          <w:b/>
+          <w:bCs/>
+          <w:color w:val="auto"/>
+        </w:rPr>
+      </w:pPr>
+      <w:r>
+        <w:rPr>
+          <w:rFonts w:ascii="Times New Roman" w:hAnsi="Times New Roman" w:cs="Times New Roman"/>
+          <w:b/>
+          <w:bCs/>
+          <w:color w:val="auto"/>
+        </w:rPr>
+        <w:t>Admin Dashboard</w:t>
+      </w:r>
+      <w:r>
+        <w:rPr>
+          <w:rFonts w:ascii="Times New Roman" w:hAnsi="Times New Roman" w:cs="Times New Roman"/>
+          <w:b/>
+          <w:bCs/>
+          <w:color w:val="auto"/>
+        </w:rPr>
+        <w:t xml:space="preserve"> (Showing the tabs)</w:t>
+      </w:r>
+    </w:p>
+    <w:p>
+      <w:r>
+        <w:drawing>
+          <wp:inline distT="0" distB="0" distL="0" distR="0" wp14:anchorId="2A27739F" wp14:editId="5DF2E4A0">
+            <wp:extent cx="5893435" cy="541655"/>
+            <wp:effectExtent l="0" t="0" r="0" b="0"/>
+            <wp:docPr id="1329240340" name="Picture 1"/>
+            <wp:cNvGraphicFramePr>
+              <a:graphicFrameLocks xmlns:a="http://schemas.openxmlformats.org/drawingml/2006/main" noChangeAspect="1"/>
+            </wp:cNvGraphicFramePr>
+            <a:graphic xmlns:a="http://schemas.openxmlformats.org/drawingml/2006/main">
+              <a:graphicData uri="http://schemas.openxmlformats.org/drawingml/2006/picture">
+                <pic:pic xmlns:pic="http://schemas.openxmlformats.org/drawingml/2006/picture">
+                  <pic:nvPicPr>
+                    <pic:cNvPr id="1329240340" name=""/>
+                    <pic:cNvPicPr/>
+                  </pic:nvPicPr>
+                  <pic:blipFill>
+                    <a:blip r:embed="rId12"/>
+                    <a:stretch>
+                      <a:fillRect/>
+                    </a:stretch>
+                  </pic:blipFill>
+                  <pic:spPr>
+                    <a:xfrm>
+                      <a:off x="0" y="0"/>
+                      <a:ext cx="5893435" cy="541655"/>
+                    </a:xfrm>
+                    <a:prstGeom prst="rect">
+                      <a:avLst/>
+                    </a:prstGeom>
+                  </pic:spPr>
+                </pic:pic>
+              </a:graphicData>
+            </a:graphic>
+          </wp:inline>
+        </w:drawing>
+      </w:r>
+    </w:p>
+    <w:p>
+      <w:pPr>
+        <w:pStyle w:val="Heading2"/>
+        <w:spacing w:line="360" w:lineRule="auto"/>
+        <w:rPr>
+          <w:rFonts w:ascii="Times New Roman" w:hAnsi="Times New Roman" w:cs="Times New Roman"/>
+          <w:b/>
+          <w:bCs/>
+          <w:color w:val="auto"/>
+        </w:rPr>
+      </w:pPr>
+      <w:r>
+        <w:rPr>
+          <w:rFonts w:ascii="Times New Roman" w:hAnsi="Times New Roman" w:cs="Times New Roman"/>
+          <w:b/>
+          <w:bCs/>
+          <w:color w:val="auto"/>
+        </w:rPr>
+        <w:t>Manage Medicine tab with da</w:t>
+      </w:r>
+      <w:r>
+        <w:rPr>
+          <w:rFonts w:ascii="Times New Roman" w:hAnsi="Times New Roman" w:cs="Times New Roman"/>
+          <w:b/>
+          <w:bCs/>
+          <w:color w:val="auto"/>
+        </w:rPr>
+        <w:t>ta</w:t>
+      </w:r>
+    </w:p>
+    <w:p>
+      <w:r>
+        <w:drawing>
+          <wp:inline distT="0" distB="0" distL="0" distR="0" wp14:anchorId="09540C28" wp14:editId="6D1BC512">
+            <wp:extent cx="5893435" cy="2094230"/>
+            <wp:effectExtent l="0" t="0" r="0" b="1270"/>
+            <wp:docPr id="215857847" name="Picture 1"/>
+            <wp:cNvGraphicFramePr>
+              <a:graphicFrameLocks xmlns:a="http://schemas.openxmlformats.org/drawingml/2006/main" noChangeAspect="1"/>
+            </wp:cNvGraphicFramePr>
+            <a:graphic xmlns:a="http://schemas.openxmlformats.org/drawingml/2006/main">
+              <a:graphicData uri="http://schemas.openxmlformats.org/drawingml/2006/picture">
+                <pic:pic xmlns:pic="http://schemas.openxmlformats.org/drawingml/2006/picture">
+                  <pic:nvPicPr>
+                    <pic:cNvPr id="215857847" name=""/>
+                    <pic:cNvPicPr/>
+                  </pic:nvPicPr>
+                  <pic:blipFill>
+                    <a:blip r:embed="rId13"/>
+                    <a:stretch>
+                      <a:fillRect/>
+                    </a:stretch>
+                  </pic:blipFill>
+                  <pic:spPr>
+                    <a:xfrm>
+                      <a:off x="0" y="0"/>
+                      <a:ext cx="5893435" cy="2094230"/>
+                    </a:xfrm>
+                    <a:prstGeom prst="rect">
+                      <a:avLst/>
+                    </a:prstGeom>
+                  </pic:spPr>
+                </pic:pic>
+              </a:graphicData>
+            </a:graphic>
+          </wp:inline>
+        </w:drawing>
+      </w:r>
+    </w:p>
+    <w:p>
+      <w:pPr>
+        <w:pStyle w:val="Heading3"/>
+        <w:rPr>
+          <w:rFonts w:ascii="Times New Roman" w:hAnsi="Times New Roman" w:cs="Times New Roman"/>
+          <w:b/>
+          <w:bCs/>
+          <w:color w:val="auto"/>
+        </w:rPr>
+      </w:pPr>
+      <w:r>
+        <w:rPr>
+          <w:rFonts w:ascii="Times New Roman" w:hAnsi="Times New Roman" w:cs="Times New Roman"/>
+          <w:b/>
+          <w:bCs/>
+          <w:color w:val="auto"/>
+        </w:rPr>
+        <w:lastRenderedPageBreak/>
+        <w:t xml:space="preserve">Manage </w:t>
+      </w:r>
+      <w:r>
+        <w:rPr>
+          <w:rFonts w:ascii="Times New Roman" w:hAnsi="Times New Roman" w:cs="Times New Roman"/>
+          <w:b/>
+          <w:bCs/>
+          <w:color w:val="auto"/>
+        </w:rPr>
+        <w:t>Supplier</w:t>
+      </w:r>
+      <w:r>
+        <w:rPr>
+          <w:rFonts w:ascii="Times New Roman" w:hAnsi="Times New Roman" w:cs="Times New Roman"/>
+          <w:b/>
+          <w:bCs/>
+          <w:color w:val="auto"/>
+        </w:rPr>
+        <w:t xml:space="preserve"> tab </w:t>
+      </w:r>
+    </w:p>
+    <w:p>
+      <w:r>
+        <w:drawing>
+          <wp:inline distT="0" distB="0" distL="0" distR="0" wp14:anchorId="082D07D1" wp14:editId="3B8DE4D9">
+            <wp:extent cx="5893435" cy="1575435"/>
+            <wp:effectExtent l="0" t="0" r="0" b="5715"/>
+            <wp:docPr id="817398529" name="Picture 1"/>
+            <wp:cNvGraphicFramePr>
+              <a:graphicFrameLocks xmlns:a="http://schemas.openxmlformats.org/drawingml/2006/main" noChangeAspect="1"/>
+            </wp:cNvGraphicFramePr>
+            <a:graphic xmlns:a="http://schemas.openxmlformats.org/drawingml/2006/main">
+              <a:graphicData uri="http://schemas.openxmlformats.org/drawingml/2006/picture">
+                <pic:pic xmlns:pic="http://schemas.openxmlformats.org/drawingml/2006/picture">
+                  <pic:nvPicPr>
+                    <pic:cNvPr id="817398529" name=""/>
+                    <pic:cNvPicPr/>
+                  </pic:nvPicPr>
+                  <pic:blipFill>
+                    <a:blip r:embed="rId14"/>
+                    <a:stretch>
+                      <a:fillRect/>
+                    </a:stretch>
+                  </pic:blipFill>
+                  <pic:spPr>
+                    <a:xfrm>
+                      <a:off x="0" y="0"/>
+                      <a:ext cx="5893435" cy="1575435"/>
+                    </a:xfrm>
+                    <a:prstGeom prst="rect">
+                      <a:avLst/>
+                    </a:prstGeom>
+                  </pic:spPr>
+                </pic:pic>
+              </a:graphicData>
+            </a:graphic>
+          </wp:inline>
+        </w:drawing>
+      </w:r>
+    </w:p>
+    <w:p>
+      <w:pPr>
+        <w:pStyle w:val="Heading3"/>
+        <w:rPr>
+          <w:rFonts w:ascii="Times New Roman" w:hAnsi="Times New Roman" w:cs="Times New Roman"/>
+          <w:b/>
+          <w:bCs/>
+          <w:color w:val="auto"/>
+        </w:rPr>
+      </w:pPr>
+      <w:r>
+        <w:rPr>
+          <w:rFonts w:ascii="Times New Roman" w:hAnsi="Times New Roman" w:cs="Times New Roman"/>
+          <w:b/>
+          <w:bCs/>
+          <w:color w:val="auto"/>
+        </w:rPr>
+        <w:t xml:space="preserve">Manage </w:t>
+      </w:r>
+      <w:r>
+        <w:rPr>
+          <w:rFonts w:ascii="Times New Roman" w:hAnsi="Times New Roman" w:cs="Times New Roman"/>
+          <w:b/>
+          <w:bCs/>
+          <w:color w:val="auto"/>
+        </w:rPr>
+        <w:t>user</w:t>
+      </w:r>
+      <w:r>
+        <w:rPr>
+          <w:rFonts w:ascii="Times New Roman" w:hAnsi="Times New Roman" w:cs="Times New Roman"/>
+          <w:b/>
+          <w:bCs/>
+          <w:color w:val="auto"/>
+        </w:rPr>
+        <w:t xml:space="preserve"> tab </w:t>
+      </w:r>
+    </w:p>
+    <w:p/>
+    <w:p>
+      <w:r>
+        <w:drawing>
+          <wp:inline distT="0" distB="0" distL="0" distR="0" wp14:anchorId="0FE7670C" wp14:editId="7CE62EDA">
+            <wp:extent cx="5893435" cy="1513840"/>
+            <wp:effectExtent l="0" t="0" r="0" b="0"/>
+            <wp:docPr id="95347102" name="Picture 1"/>
+            <wp:cNvGraphicFramePr>
+              <a:graphicFrameLocks xmlns:a="http://schemas.openxmlformats.org/drawingml/2006/main" noChangeAspect="1"/>
+            </wp:cNvGraphicFramePr>
+            <a:graphic xmlns:a="http://schemas.openxmlformats.org/drawingml/2006/main">
+              <a:graphicData uri="http://schemas.openxmlformats.org/drawingml/2006/picture">
+                <pic:pic xmlns:pic="http://schemas.openxmlformats.org/drawingml/2006/picture">
+                  <pic:nvPicPr>
+                    <pic:cNvPr id="95347102" name=""/>
+                    <pic:cNvPicPr/>
+                  </pic:nvPicPr>
+                  <pic:blipFill>
+                    <a:blip r:embed="rId15"/>
+                    <a:stretch>
+                      <a:fillRect/>
+                    </a:stretch>
+                  </pic:blipFill>
+                  <pic:spPr>
+                    <a:xfrm>
+                      <a:off x="0" y="0"/>
+                      <a:ext cx="5893435" cy="1513840"/>
+                    </a:xfrm>
+                    <a:prstGeom prst="rect">
+                      <a:avLst/>
+                    </a:prstGeom>
+                  </pic:spPr>
+                </pic:pic>
+              </a:graphicData>
+            </a:graphic>
+          </wp:inline>
+        </w:drawing>
+      </w:r>
+    </w:p>
+    <w:p>
+      <w:pPr>
+        <w:pStyle w:val="Heading3"/>
+        <w:rPr>
+          <w:rFonts w:ascii="Times New Roman" w:hAnsi="Times New Roman" w:cs="Times New Roman"/>
+          <w:b/>
+          <w:bCs/>
+          <w:color w:val="auto"/>
+        </w:rPr>
+      </w:pPr>
+      <w:r>
+        <w:rPr>
+          <w:rFonts w:ascii="Times New Roman" w:hAnsi="Times New Roman" w:cs="Times New Roman"/>
+          <w:b/>
+          <w:bCs/>
+          <w:color w:val="auto"/>
+        </w:rPr>
+        <w:t xml:space="preserve">Manage </w:t>
+      </w:r>
+      <w:r>
+        <w:rPr>
+          <w:rFonts w:ascii="Times New Roman" w:hAnsi="Times New Roman" w:cs="Times New Roman"/>
+          <w:b/>
+          <w:bCs/>
+          <w:color w:val="auto"/>
+        </w:rPr>
+        <w:t xml:space="preserve">POS </w:t>
+      </w:r>
+      <w:r>
+        <w:rPr>
+          <w:rFonts w:ascii="Times New Roman" w:hAnsi="Times New Roman" w:cs="Times New Roman"/>
+          <w:b/>
+          <w:bCs/>
+          <w:color w:val="auto"/>
+        </w:rPr>
+        <w:t xml:space="preserve">tab </w:t>
+      </w:r>
+    </w:p>
+    <w:p/>
+    <w:p>
+      <w:r>
+        <w:drawing>
+          <wp:inline distT="0" distB="0" distL="0" distR="0" wp14:anchorId="06C61B40" wp14:editId="098242F1">
+            <wp:extent cx="5893435" cy="987425"/>
+            <wp:effectExtent l="0" t="0" r="0" b="3175"/>
+            <wp:docPr id="1604398237" name="Picture 1"/>
+            <wp:cNvGraphicFramePr>
+              <a:graphicFrameLocks xmlns:a="http://schemas.openxmlformats.org/drawingml/2006/main" noChangeAspect="1"/>
+            </wp:cNvGraphicFramePr>
+            <a:graphic xmlns:a="http://schemas.openxmlformats.org/drawingml/2006/main">
+              <a:graphicData uri="http://schemas.openxmlformats.org/drawingml/2006/picture">
+                <pic:pic xmlns:pic="http://schemas.openxmlformats.org/drawingml/2006/picture">
+                  <pic:nvPicPr>
+                    <pic:cNvPr id="1604398237" name=""/>
+                    <pic:cNvPicPr/>
+                  </pic:nvPicPr>
+                  <pic:blipFill>
+                    <a:blip r:embed="rId16"/>
+                    <a:stretch>
+                      <a:fillRect/>
+                    </a:stretch>
+                  </pic:blipFill>
+                  <pic:spPr>
+                    <a:xfrm>
+                      <a:off x="0" y="0"/>
+                      <a:ext cx="5893435" cy="987425"/>
+                    </a:xfrm>
+                    <a:prstGeom prst="rect">
+                      <a:avLst/>
+                    </a:prstGeom>
+                  </pic:spPr>
+                </pic:pic>
+              </a:graphicData>
+            </a:graphic>
+          </wp:inline>
+        </w:drawing>
+      </w:r>
+    </w:p>
+    <w:p>
+      <w:pPr>
+        <w:pStyle w:val="Heading3"/>
+        <w:rPr>
+          <w:rFonts w:ascii="Times New Roman" w:hAnsi="Times New Roman" w:cs="Times New Roman"/>
+          <w:b/>
+          <w:bCs/>
+          <w:color w:val="auto"/>
+        </w:rPr>
+      </w:pPr>
+      <w:r>
+        <w:rPr>
+          <w:rFonts w:ascii="Times New Roman" w:hAnsi="Times New Roman" w:cs="Times New Roman"/>
+          <w:b/>
+          <w:bCs/>
+          <w:color w:val="auto"/>
+        </w:rPr>
+        <w:t xml:space="preserve">Manage </w:t>
+      </w:r>
+      <w:r>
+        <w:rPr>
+          <w:rFonts w:ascii="Times New Roman" w:hAnsi="Times New Roman" w:cs="Times New Roman"/>
+          <w:b/>
+          <w:bCs/>
+          <w:color w:val="auto"/>
+        </w:rPr>
+        <w:t>Reports</w:t>
+      </w:r>
+      <w:r>
+        <w:rPr>
+          <w:rFonts w:ascii="Times New Roman" w:hAnsi="Times New Roman" w:cs="Times New Roman"/>
+          <w:b/>
+          <w:bCs/>
+          <w:color w:val="auto"/>
+        </w:rPr>
+        <w:t xml:space="preserve"> </w:t>
+      </w:r>
+      <w:r>
+        <w:rPr>
+          <w:rFonts w:ascii="Times New Roman" w:hAnsi="Times New Roman" w:cs="Times New Roman"/>
+          <w:b/>
+          <w:bCs/>
+          <w:color w:val="auto"/>
+        </w:rPr>
+        <w:t xml:space="preserve">tab </w:t>
+      </w:r>
+    </w:p>
+    <w:p/>
+    <w:p>
+      <w:r>
+        <w:drawing>
+          <wp:inline distT="0" distB="0" distL="0" distR="0" wp14:anchorId="2E45BB89" wp14:editId="1FE1E64C">
+            <wp:extent cx="5893435" cy="946150"/>
+            <wp:effectExtent l="0" t="0" r="0" b="6350"/>
+            <wp:docPr id="1523449875" name="Picture 1"/>
+            <wp:cNvGraphicFramePr>
+              <a:graphicFrameLocks xmlns:a="http://schemas.openxmlformats.org/drawingml/2006/main" noChangeAspect="1"/>
+            </wp:cNvGraphicFramePr>
+            <a:graphic xmlns:a="http://schemas.openxmlformats.org/drawingml/2006/main">
+              <a:graphicData uri="http://schemas.openxmlformats.org/drawingml/2006/picture">
+                <pic:pic xmlns:pic="http://schemas.openxmlformats.org/drawingml/2006/picture">
+                  <pic:nvPicPr>
+                    <pic:cNvPr id="1523449875" name=""/>
+                    <pic:cNvPicPr/>
+                  </pic:nvPicPr>
+                  <pic:blipFill>
+                    <a:blip r:embed="rId17"/>
+                    <a:stretch>
+                      <a:fillRect/>
+                    </a:stretch>
+                  </pic:blipFill>
+                  <pic:spPr>
+                    <a:xfrm>
+                      <a:off x="0" y="0"/>
+                      <a:ext cx="5893435" cy="946150"/>
+                    </a:xfrm>
+                    <a:prstGeom prst="rect">
+                      <a:avLst/>
+                    </a:prstGeom>
+                  </pic:spPr>
+                </pic:pic>
+              </a:graphicData>
+            </a:graphic>
+          </wp:inline>
+        </w:drawing>
+      </w:r>
+    </w:p>
+    <w:p>
+      <w:pPr>
+        <w:pStyle w:val="Heading2"/>
+        <w:spacing w:line="360" w:lineRule="auto"/>
+        <w:rPr>
+          <w:rFonts w:ascii="Times New Roman" w:hAnsi="Times New Roman" w:cs="Times New Roman"/>
+          <w:b/>
+          <w:bCs/>
+          <w:color w:val="auto"/>
+        </w:rPr>
+      </w:pPr>
+      <w:r>
+        <w:rPr>
+          <w:rFonts w:ascii="Times New Roman" w:hAnsi="Times New Roman" w:cs="Times New Roman"/>
+          <w:b/>
+          <w:bCs/>
+          <w:color w:val="auto"/>
+        </w:rPr>
+        <w:lastRenderedPageBreak/>
+        <w:t>Cashier POS Screen with items in cart</w:t>
+      </w:r>
+    </w:p>
+    <w:p>
+      <w:r>
+        <w:drawing>
+          <wp:inline distT="0" distB="0" distL="0" distR="0" wp14:anchorId="745D3A19" wp14:editId="7E26B4DE">
+            <wp:extent cx="5893435" cy="1506220"/>
+            <wp:effectExtent l="0" t="0" r="0" b="0"/>
+            <wp:docPr id="695837538" name="Picture 1"/>
+            <wp:cNvGraphicFramePr>
+              <a:graphicFrameLocks xmlns:a="http://schemas.openxmlformats.org/drawingml/2006/main" noChangeAspect="1"/>
+            </wp:cNvGraphicFramePr>
+            <a:graphic xmlns:a="http://schemas.openxmlformats.org/drawingml/2006/main">
+              <a:graphicData uri="http://schemas.openxmlformats.org/drawingml/2006/picture">
+                <pic:pic xmlns:pic="http://schemas.openxmlformats.org/drawingml/2006/picture">
+                  <pic:nvPicPr>
+                    <pic:cNvPr id="695837538" name=""/>
+                    <pic:cNvPicPr/>
+                  </pic:nvPicPr>
+                  <pic:blipFill>
+                    <a:blip r:embed="rId18"/>
+                    <a:stretch>
+                      <a:fillRect/>
+                    </a:stretch>
+                  </pic:blipFill>
+                  <pic:spPr>
+                    <a:xfrm>
+                      <a:off x="0" y="0"/>
+                      <a:ext cx="5893435" cy="1506220"/>
+                    </a:xfrm>
+                    <a:prstGeom prst="rect">
+                      <a:avLst/>
+                    </a:prstGeom>
+                  </pic:spPr>
+                </pic:pic>
+              </a:graphicData>
+            </a:graphic>
+          </wp:inline>
+        </w:drawing>
+      </w:r>
+    </w:p>
+    <w:p>
+      <w:pPr>
+        <w:pStyle w:val="Heading2"/>
+        <w:spacing w:line="360" w:lineRule="auto"/>
+        <w:rPr>
+          <w:rFonts w:ascii="Times New Roman" w:hAnsi="Times New Roman" w:cs="Times New Roman"/>
+          <w:b/>
+          <w:bCs/>
+          <w:color w:val="auto"/>
+        </w:rPr>
+      </w:pPr>
+      <w:r>
+        <w:rPr>
+          <w:rFonts w:ascii="Times New Roman" w:hAnsi="Times New Roman" w:cs="Times New Roman"/>
+          <w:b/>
+          <w:bCs/>
+          <w:color w:val="auto"/>
+        </w:rPr>
+        <w:t>Bill window</w:t>
+      </w:r>
+    </w:p>
+    <w:p>
+      <w:r>
+        <w:drawing>
+          <wp:inline distT="0" distB="0" distL="0" distR="0" wp14:anchorId="11A3276C" wp14:editId="6AD25853">
+            <wp:extent cx="5893435" cy="3751580"/>
+            <wp:effectExtent l="0" t="0" r="0" b="1270"/>
+            <wp:docPr id="1727857868" name="Picture 1"/>
+            <wp:cNvGraphicFramePr>
+              <a:graphicFrameLocks xmlns:a="http://schemas.openxmlformats.org/drawingml/2006/main" noChangeAspect="1"/>
+            </wp:cNvGraphicFramePr>
+            <a:graphic xmlns:a="http://schemas.openxmlformats.org/drawingml/2006/main">
+              <a:graphicData uri="http://schemas.openxmlformats.org/drawingml/2006/picture">
+                <pic:pic xmlns:pic="http://schemas.openxmlformats.org/drawingml/2006/picture">
+                  <pic:nvPicPr>
+                    <pic:cNvPr id="1727857868" name=""/>
+                    <pic:cNvPicPr/>
+                  </pic:nvPicPr>
+                  <pic:blipFill>
+                    <a:blip r:embed="rId19"/>
+                    <a:stretch>
+                      <a:fillRect/>
+                    </a:stretch>
+                  </pic:blipFill>
+                  <pic:spPr>
+                    <a:xfrm>
+                      <a:off x="0" y="0"/>
+                      <a:ext cx="5893435" cy="3751580"/>
+                    </a:xfrm>
+                    <a:prstGeom prst="rect">
+                      <a:avLst/>
+                    </a:prstGeom>
+                  </pic:spPr>
+                </pic:pic>
+              </a:graphicData>
+            </a:graphic>
+          </wp:inline>
+        </w:drawing>
+      </w:r>
+    </w:p>
+    <w:p>
+      <w:pPr>
+        <w:pStyle w:val="Heading2"/>
+        <w:spacing w:line="360" w:lineRule="auto"/>
+        <w:rPr>
+          <w:rFonts w:ascii="Times New Roman" w:hAnsi="Times New Roman" w:cs="Times New Roman"/>
+          <w:b/>
+          <w:bCs/>
+          <w:color w:val="auto"/>
+        </w:rPr>
+      </w:pPr>
+      <w:r>
+        <w:rPr>
+          <w:rFonts w:ascii="Times New Roman" w:hAnsi="Times New Roman" w:cs="Times New Roman"/>
+          <w:b/>
+          <w:bCs/>
+          <w:color w:val="auto"/>
+        </w:rPr>
+        <w:t>Sales</w:t>
+      </w:r>
+    </w:p>
+    <w:p>
+      <w:r>
+        <w:drawing>
+          <wp:inline distT="0" distB="0" distL="0" distR="0" wp14:anchorId="4D7696FC" wp14:editId="2CAD05B5">
+            <wp:extent cx="5893435" cy="986155"/>
+            <wp:effectExtent l="0" t="0" r="0" b="4445"/>
+            <wp:docPr id="3243345" name="Picture 1"/>
+            <wp:cNvGraphicFramePr>
+              <a:graphicFrameLocks xmlns:a="http://schemas.openxmlformats.org/drawingml/2006/main" noChangeAspect="1"/>
+            </wp:cNvGraphicFramePr>
+            <a:graphic xmlns:a="http://schemas.openxmlformats.org/drawingml/2006/main">
+              <a:graphicData uri="http://schemas.openxmlformats.org/drawingml/2006/picture">
+                <pic:pic xmlns:pic="http://schemas.openxmlformats.org/drawingml/2006/picture">
+                  <pic:nvPicPr>
+                    <pic:cNvPr id="3243345" name=""/>
+                    <pic:cNvPicPr/>
+                  </pic:nvPicPr>
+                  <pic:blipFill>
+                    <a:blip r:embed="rId20"/>
+                    <a:stretch>
+                      <a:fillRect/>
+                    </a:stretch>
+                  </pic:blipFill>
+                  <pic:spPr>
+                    <a:xfrm>
+                      <a:off x="0" y="0"/>
+                      <a:ext cx="5893435" cy="986155"/>
+                    </a:xfrm>
+                    <a:prstGeom prst="rect">
+                      <a:avLst/>
+                    </a:prstGeom>
+                  </pic:spPr>
+                </pic:pic>
+              </a:graphicData>
+            </a:graphic>
+          </wp:inline>
+        </w:drawing>
+      </w:r>
+    </w:p>
+    <w:p>
+      <w:pPr>
+        <w:pStyle w:val="Heading2"/>
+        <w:spacing w:line="360" w:lineRule="auto"/>
+        <w:rPr>
+          <w:rFonts w:ascii="Times New Roman" w:hAnsi="Times New Roman" w:cs="Times New Roman"/>
+          <w:b/>
+          <w:bCs/>
+          <w:color w:val="auto"/>
+        </w:rPr>
+      </w:pPr>
+      <w:r>
+        <w:rPr>
+          <w:rFonts w:ascii="Times New Roman" w:hAnsi="Times New Roman" w:cs="Times New Roman"/>
+          <w:b/>
+          <w:bCs/>
+          <w:color w:val="auto"/>
+        </w:rPr>
+        <w:t>Item-wise</w:t>
+      </w:r>
+    </w:p>
+    <w:p>
+      <w:r>
+        <w:drawing>
+          <wp:inline distT="0" distB="0" distL="0" distR="0" wp14:anchorId="43647E6E" wp14:editId="002B4FC3">
+            <wp:extent cx="5893435" cy="1012825"/>
+            <wp:effectExtent l="0" t="0" r="0" b="0"/>
+            <wp:docPr id="1061458963" name="Picture 1"/>
+            <wp:cNvGraphicFramePr>
+              <a:graphicFrameLocks xmlns:a="http://schemas.openxmlformats.org/drawingml/2006/main" noChangeAspect="1"/>
+            </wp:cNvGraphicFramePr>
+            <a:graphic xmlns:a="http://schemas.openxmlformats.org/drawingml/2006/main">
+              <a:graphicData uri="http://schemas.openxmlformats.org/drawingml/2006/picture">
+                <pic:pic xmlns:pic="http://schemas.openxmlformats.org/drawingml/2006/picture">
+                  <pic:nvPicPr>
+                    <pic:cNvPr id="1061458963" name=""/>
+                    <pic:cNvPicPr/>
+                  </pic:nvPicPr>
+                  <pic:blipFill>
+                    <a:blip r:embed="rId21"/>
+                    <a:stretch>
+                      <a:fillRect/>
+                    </a:stretch>
+                  </pic:blipFill>
+                  <pic:spPr>
+                    <a:xfrm>
+                      <a:off x="0" y="0"/>
+                      <a:ext cx="5893435" cy="1012825"/>
+                    </a:xfrm>
+                    <a:prstGeom prst="rect">
+                      <a:avLst/>
+                    </a:prstGeom>
+                  </pic:spPr>
+                </pic:pic>
+              </a:graphicData>
+            </a:graphic>
+          </wp:inline>
+        </w:drawing>
+      </w:r>
+    </w:p>
+    <w:p>
+      <w:pPr>
+        <w:pStyle w:val="Heading2"/>
+        <w:spacing w:line="360" w:lineRule="auto"/>
+        <w:rPr>
+          <w:rFonts w:ascii="Times New Roman" w:hAnsi="Times New Roman" w:cs="Times New Roman"/>
+          <w:b/>
+          <w:bCs/>
+          <w:color w:val="auto"/>
+        </w:rPr>
+      </w:pPr>
+      <w:r>
+        <w:rPr>
+          <w:rFonts w:ascii="Times New Roman" w:hAnsi="Times New Roman" w:cs="Times New Roman"/>
+          <w:b/>
+          <w:bCs/>
+          <w:color w:val="auto"/>
+        </w:rPr>
+        <w:lastRenderedPageBreak/>
+        <w:t>Low Stock</w:t>
+      </w:r>
+    </w:p>
+    <w:p/>
+    <w:p>
+      <w:pPr>
+        <w:pStyle w:val="Heading2"/>
+        <w:spacing w:line="360" w:lineRule="auto"/>
+        <w:rPr>
+          <w:rFonts w:ascii="Times New Roman" w:hAnsi="Times New Roman" w:cs="Times New Roman"/>
+          <w:b/>
+          <w:bCs/>
+          <w:color w:val="auto"/>
+        </w:rPr>
+      </w:pPr>
+      <w:r>
+        <w:rPr>
+          <w:rFonts w:ascii="Times New Roman" w:hAnsi="Times New Roman" w:cs="Times New Roman"/>
+          <w:b/>
+          <w:bCs/>
+          <w:color w:val="auto"/>
+        </w:rPr>
+        <w:t>Expiry date</w:t>
+      </w:r>
+    </w:p>
+    <w:p>
+      <w:pPr>
+        <w:spacing w:line="360" w:lineRule="auto"/>
+      </w:pPr>
+    </w:p>
+    <w:p/>
+    <w:p/>
+    <w:p/>
+    <w:p/>
+    <w:p>
+      <w:pPr>
+        <w:spacing w:after="0" w:line="437" w:lineRule="auto"/>
+        <w:rPr>
+          <w:rFonts w:ascii="Times New Roman" w:eastAsia="Tahoma" w:hAnsi="Times New Roman" w:cs="Times New Roman"/>
+          <w:b/>
+          <w:sz w:val="24"/>
+        </w:rPr>
+      </w:pPr>
+    </w:p>
+    <w:p>
+      <w:pPr>
+        <w:spacing w:after="0" w:line="437" w:lineRule="auto"/>
+        <w:rPr>
+          <w:rFonts w:ascii="Times New Roman" w:eastAsia="Tahoma" w:hAnsi="Times New Roman" w:cs="Times New Roman"/>
+          <w:b/>
+          <w:sz w:val="24"/>
+        </w:rPr>
+      </w:pPr>
+    </w:p>
+    <w:p>
+      <w:pPr>
+        <w:spacing w:after="0" w:line="437" w:lineRule="auto"/>
+        <w:rPr>
+          <w:rFonts w:ascii="Tahoma" w:eastAsia="Tahoma" w:hAnsi="Tahoma" w:cs="Tahoma"/>
+          <w:b/>
+          <w:sz w:val="12"/>
+        </w:rPr>
+      </w:pPr>
+    </w:p>
+    <w:p>
+      <w:pPr>
+        <w:spacing w:after="0" w:line="437" w:lineRule="auto"/>
+        <w:rPr>
+          <w:rFonts w:ascii="Tahoma" w:eastAsia="Tahoma" w:hAnsi="Tahoma" w:cs="Tahoma"/>
+          <w:b/>
+          <w:sz w:val="12"/>
+        </w:rPr>
+      </w:pPr>
+    </w:p>
+    <w:p>
+      <w:pPr>
+        <w:spacing w:after="0" w:line="437" w:lineRule="auto"/>
+        <w:rPr>
+          <w:rFonts w:ascii="Tahoma" w:eastAsia="Tahoma" w:hAnsi="Tahoma" w:cs="Tahoma"/>
+          <w:b/>
+          <w:sz w:val="12"/>
+        </w:rPr>
+      </w:pPr>
+    </w:p>
+    <w:p>
+      <w:pPr>
+        <w:spacing w:after="0" w:line="437" w:lineRule="auto"/>
+        <w:rPr>
+          <w:rFonts w:ascii="Tahoma" w:eastAsia="Tahoma" w:hAnsi="Tahoma" w:cs="Tahoma"/>
+          <w:b/>
+          <w:sz w:val="12"/>
+        </w:rPr>
+      </w:pPr>
+    </w:p>
+    <w:p>
+      <w:pPr>
+        <w:spacing w:after="0" w:line="437" w:lineRule="auto"/>
+        <w:rPr>
+          <w:rFonts w:ascii="Tahoma" w:eastAsia="Tahoma" w:hAnsi="Tahoma" w:cs="Tahoma"/>
+          <w:b/>
+          <w:sz w:val="12"/>
+        </w:rPr>
+      </w:pPr>
+    </w:p>
+    <w:p>
+      <w:pPr>
+        <w:spacing w:after="0" w:line="437" w:lineRule="auto"/>
+        <w:rPr>
+          <w:rFonts w:ascii="Tahoma" w:eastAsia="Tahoma" w:hAnsi="Tahoma" w:cs="Tahoma"/>
+          <w:b/>
+          <w:sz w:val="12"/>
+        </w:rPr>
+      </w:pPr>
+    </w:p>
+    <w:p>
+      <w:pPr>
+        <w:spacing w:after="0" w:line="437" w:lineRule="auto"/>
+      </w:pPr>
+      <w:r>
+        <w:rPr>
+          <w:rFonts w:ascii="Tahoma" w:eastAsia="Tahoma" w:hAnsi="Tahoma" w:cs="Tahoma"/>
+          <w:b/>
+          <w:sz w:val="12"/>
+        </w:rPr>
+        <w:t xml:space="preserve">Github link : </w:t>
+      </w:r>
+      <w:r>
+        <w:rPr>
+          <w:rFonts w:ascii="Tahoma" w:eastAsia="Tahoma" w:hAnsi="Tahoma" w:cs="Tahoma"/>
+          <w:b/>
+          <w:sz w:val="12"/>
+        </w:rPr>
+        <w:t>https://github.com/kamo-vee/PIMS_Kamogelo_Valencia_Bosele_402410769</w:t>
       </w:r>
     </w:p>
     <w:sectPr>
@@ -5295,10 +6472,73 @@
       <w:sz w:val="22"/>
     </w:rPr>
   </w:style>
+  <w:style w:type="paragraph" w:styleId="Heading1">
+    <w:name w:val="heading 1"/>
+    <w:basedOn w:val="Normal"/>
+    <w:next w:val="Normal"/>
+    <w:link w:val="Heading1Char"/>
+    <w:uiPriority w:val="9"/>
+    <w:qFormat/>
+    <w:rsid w:val="0031410D"/>
+    <w:pPr>
+      <w:keepNext/>
+      <w:keepLines/>
+      <w:spacing w:before="240" w:after="0"/>
+      <w:outlineLvl w:val="0"/>
+    </w:pPr>
+    <w:rPr>
+      <w:rFonts w:asciiTheme="majorHAnsi" w:eastAsiaTheme="majorEastAsia" w:hAnsiTheme="majorHAnsi" w:cstheme="majorBidi"/>
+      <w:color w:val="0F4761" w:themeColor="accent1" w:themeShade="BF"/>
+      <w:sz w:val="32"/>
+      <w:szCs w:val="32"/>
+    </w:rPr>
+  </w:style>
+  <w:style w:type="paragraph" w:styleId="Heading2">
+    <w:name w:val="heading 2"/>
+    <w:basedOn w:val="Normal"/>
+    <w:next w:val="Normal"/>
+    <w:link w:val="Heading2Char"/>
+    <w:uiPriority w:val="9"/>
+    <w:unhideWhenUsed/>
+    <w:qFormat/>
+    <w:rsid w:val="0031410D"/>
+    <w:pPr>
+      <w:keepNext/>
+      <w:keepLines/>
+      <w:spacing w:before="40" w:after="0"/>
+      <w:outlineLvl w:val="1"/>
+    </w:pPr>
+    <w:rPr>
+      <w:rFonts w:asciiTheme="majorHAnsi" w:eastAsiaTheme="majorEastAsia" w:hAnsiTheme="majorHAnsi" w:cstheme="majorBidi"/>
+      <w:color w:val="0F4761" w:themeColor="accent1" w:themeShade="BF"/>
+      <w:sz w:val="26"/>
+      <w:szCs w:val="26"/>
+    </w:rPr>
+  </w:style>
+  <w:style w:type="paragraph" w:styleId="Heading3">
+    <w:name w:val="heading 3"/>
+    <w:basedOn w:val="Normal"/>
+    <w:next w:val="Normal"/>
+    <w:link w:val="Heading3Char"/>
+    <w:uiPriority w:val="9"/>
+    <w:unhideWhenUsed/>
+    <w:qFormat/>
+    <w:rsid w:val="00A55212"/>
+    <w:pPr>
+      <w:keepNext/>
+      <w:keepLines/>
+      <w:spacing w:before="40" w:after="0"/>
+      <w:outlineLvl w:val="2"/>
+    </w:pPr>
+    <w:rPr>
+      <w:rFonts w:asciiTheme="majorHAnsi" w:eastAsiaTheme="majorEastAsia" w:hAnsiTheme="majorHAnsi" w:cstheme="majorBidi"/>
+      <w:color w:val="0A2F40" w:themeColor="accent1" w:themeShade="7F"/>
+      <w:sz w:val="24"/>
+    </w:rPr>
+  </w:style>
   <w:style w:type="character" w:default="1" w:styleId="DefaultParagraphFont">
     <w:name w:val="Default Paragraph Font"/>
     <w:uiPriority w:val="1"/>
-    <w:semiHidden/>
     <w:unhideWhenUsed/>
   </w:style>
   <w:style w:type="table" w:default="1" w:styleId="TableNormal">
@@ -5335,6 +6575,60 @@
         <w:right w:w="0" w:type="dxa"/>
       </w:tblCellMar>
     </w:tblPr>
+  </w:style>
+  <w:style w:type="character" w:customStyle="1" w:styleId="Heading1Char">
+    <w:name w:val="Heading 1 Char"/>
+    <w:basedOn w:val="DefaultParagraphFont"/>
+    <w:link w:val="Heading1"/>
+    <w:uiPriority w:val="9"/>
+    <w:rsid w:val="0031410D"/>
+    <w:rPr>
+      <w:rFonts w:asciiTheme="majorHAnsi" w:eastAsiaTheme="majorEastAsia" w:hAnsiTheme="majorHAnsi" w:cstheme="majorBidi"/>
+      <w:color w:val="0F4761" w:themeColor="accent1" w:themeShade="BF"/>
+      <w:sz w:val="32"/>
+      <w:szCs w:val="32"/>
+    </w:rPr>
+  </w:style>
+  <w:style w:type="paragraph" w:styleId="TOCHeading">
+    <w:name w:val="TOC Heading"/>
+    <w:basedOn w:val="Heading1"/>
+    <w:next w:val="Normal"/>
+    <w:uiPriority w:val="39"/>
+    <w:unhideWhenUsed/>
+    <w:qFormat/>
+    <w:rsid w:val="0031410D"/>
+    <w:pPr>
+      <w:outlineLvl w:val="9"/>
+    </w:pPr>
+    <w:rPr>
+      <w:kern w:val="0"/>
+      <w:lang w:val="en-US" w:eastAsia="en-US"/>
+      <w14:ligatures w14:val="none"/>
+    </w:rPr>
+  </w:style>
+  <w:style w:type="character" w:customStyle="1" w:styleId="Heading2Char">
+    <w:name w:val="Heading 2 Char"/>
+    <w:basedOn w:val="DefaultParagraphFont"/>
+    <w:link w:val="Heading2"/>
+    <w:uiPriority w:val="9"/>
+    <w:rsid w:val="0031410D"/>
+    <w:rPr>
+      <w:rFonts w:asciiTheme="majorHAnsi" w:eastAsiaTheme="majorEastAsia" w:hAnsiTheme="majorHAnsi" w:cstheme="majorBidi"/>
+      <w:color w:val="0F4761" w:themeColor="accent1" w:themeShade="BF"/>
+      <w:sz w:val="26"/>
+      <w:szCs w:val="26"/>
+    </w:rPr>
+  </w:style>
+  <w:style w:type="character" w:customStyle="1" w:styleId="Heading3Char">
+    <w:name w:val="Heading 3 Char"/>
+    <w:basedOn w:val="DefaultParagraphFont"/>
+    <w:link w:val="Heading3"/>
+    <w:uiPriority w:val="9"/>
+    <w:rsid w:val="00A55212"/>
+    <w:rPr>
+      <w:rFonts w:asciiTheme="majorHAnsi" w:eastAsiaTheme="majorEastAsia" w:hAnsiTheme="majorHAnsi" w:cstheme="majorBidi"/>
+      <w:color w:val="0A2F40" w:themeColor="accent1" w:themeShade="7F"/>
+    </w:rPr>
   </w:style>
 </w:styles>
 </file>
@@ -5652,4 +6946,16 @@
     </a:ext>
   </a:extLst>
 </a:theme>
+</file>
+
+<file path=customXml/item1.xml><?xml version="1.0" encoding="utf-8"?>
+<b:Sources xmlns:b="http://schemas.openxmlformats.org/officeDocument/2006/bibliography" xmlns="http://schemas.openxmlformats.org/officeDocument/2006/bibliography" SelectedStyle="\HarvardAnglia2008OfficeOnline.xsl" StyleName="Harvard - Anglia" Version="2008"/>
+</file>
+
+<file path=customXml/itemProps1.xml><?xml version="1.0" encoding="utf-8"?>
+<ds:datastoreItem xmlns:ds="http://schemas.openxmlformats.org/officeDocument/2006/customXml" ds:itemID="{6FEA6962-C590-4881-A595-F91D7A9D00A1}">
+  <ds:schemaRefs>
+    <ds:schemaRef ds:uri="http://schemas.openxmlformats.org/officeDocument/2006/bibliography"/>
+  </ds:schemaRefs>
+</ds:datastoreItem>
 </file>
</xml_diff>